<commit_message>
Regenerate docx files to fix formatting issues
</commit_message>
<xml_diff>
--- a/Task_1_Iris_EDA_Report.docx
+++ b/Task_1_Iris_EDA_Report.docx
@@ -20,7 +20,7 @@
     </w:p>
     <w:p>
       <w:r>
-        <w:t>This project focused on performing an exploratory data analysis (EDA) on the Iris dataset, which consists of 150 iris flowers classified into three species: *Iris setosa*, *Iris versicolor*, and *Iris virginica*. The primary objective was to visualize the feature distributions and understand the relationships between them to facilitate future classification modeling.</w:t>
+        <w:t>This project focused on performing an exploratory data analysis (EDA) on the Iris dataset, which consists of 150 iris flowers classified into three species: Iris setosa, Iris versicolor, and Iris virginica. The primary objective was to visualize the feature distributions and understand the relationships between them to facilitate future classification modeling.</w:t>
       </w:r>
     </w:p>
     <w:p>
@@ -36,32 +36,47 @@
         <w:pStyle w:val="ListNumber"/>
       </w:pPr>
       <w:r>
-        <w:t xml:space="preserve"> **Data Loading**: Loaded the Iris dataset using `pandas`.</w:t>
+        <w:t>Data Loading: Loaded the Iris dataset using pandas.</w:t>
       </w:r>
     </w:p>
     <w:p>
+      <w:pPr>
+        <w:pStyle w:val="ListNumber"/>
+      </w:pPr>
       <w:r>
-        <w:t>2.  **Visualization**:</w:t>
+        <w:t>Visualization:</w:t>
       </w:r>
     </w:p>
     <w:p>
+      <w:pPr>
+        <w:pStyle w:val="ListBullet"/>
+      </w:pPr>
       <w:r>
-        <w:t xml:space="preserve">    *   Utilized **Plotly** to create interactive visualizations for better exploration.</w:t>
+        <w:t>Utilized Plotly to create interactive visualizations for better exploration.</w:t>
       </w:r>
     </w:p>
     <w:p>
+      <w:pPr>
+        <w:pStyle w:val="ListBullet"/>
+      </w:pPr>
       <w:r>
-        <w:t xml:space="preserve">    *   Constructed histograms to analyze individual feature distributions.</w:t>
+        <w:t>Constructed histograms to analyze individual feature distributions.</w:t>
       </w:r>
     </w:p>
     <w:p>
+      <w:pPr>
+        <w:pStyle w:val="ListBullet"/>
+      </w:pPr>
       <w:r>
-        <w:t xml:space="preserve">    *   Generated scatter plots to observe the correlation between sepal and petal dimensions.</w:t>
+        <w:t>Generated scatter plots to observe the correlation between sepal and petal dimensions.</w:t>
       </w:r>
     </w:p>
     <w:p>
+      <w:pPr>
+        <w:pStyle w:val="ListBullet"/>
+      </w:pPr>
       <w:r>
-        <w:t xml:space="preserve">    *   Produced 3D scatter plots to examine how features separate the different species in a higher-dimensional space.</w:t>
+        <w:t>Produced 3D scatter plots to examine how features separate the different species in a higher-dimensional space.</w:t>
       </w:r>
     </w:p>
     <w:p>
@@ -77,7 +92,7 @@
         <w:pStyle w:val="ListBullet"/>
       </w:pPr>
       <w:r>
-        <w:t xml:space="preserve">  Petal length and width provide the strongest separation between the three species.</w:t>
+        <w:t>Petal length and width provide the strongest separation between the three species.</w:t>
       </w:r>
     </w:p>
     <w:p>
@@ -85,7 +100,7 @@
         <w:pStyle w:val="ListBullet"/>
       </w:pPr>
       <w:r>
-        <w:t xml:space="preserve">  Species categorization is highly distinct when analyzing the relationship between petal dimensions.</w:t>
+        <w:t>Species categorization is highly distinct when analyzing the relationship between petal dimensions.</w:t>
       </w:r>
     </w:p>
     <w:p>
@@ -93,7 +108,7 @@
         <w:pStyle w:val="ListBullet"/>
       </w:pPr>
       <w:r>
-        <w:t xml:space="preserve">  The data is well-structured and serves as an ideal baseline for classification tasks.</w:t>
+        <w:t>The data is well-structured and serves as an ideal baseline for classification tasks.</w:t>
       </w:r>
     </w:p>
     <w:p>

</xml_diff>